<commit_message>
Coating calc: fix thermal-mismatch formula, add refinements and sources
Co-Authored-By: Claude Opus 5.5 <noreply@anthropic.com>
Claude-Session: https://claude.ai/code/session_01GPvk52V93SFuebp6VWmTKz
</commit_message>
<xml_diff>
--- a/Расчёт_покрытия_диска.docx
+++ b/Расчёт_покрытия_диска.docx
@@ -1216,6 +1216,18 @@
       </w:pPr>
       <w:r>
         <w:rPr>
+          <w:i/>
+          <w:iCs/>
+        </w:rPr>
+        <w:t xml:space="preserve">Точная формула: p = ρω²·[(R + h)² − R²] / (2R) = ρ·h·ω²·R·(1 + h/2R). Поправка h/2R = 0,024 %, ею можно пренебречь.</w:t>
+      </w:r>
+    </w:p>
+    <w:p>
+      <w:pPr>
+        <w:spacing w:after="120"/>
+      </w:pPr>
+      <w:r>
+        <w:rPr>
           <w:b/>
           <w:bCs/>
         </w:rPr>
@@ -1428,6 +1440,18 @@
           <w:szCs w:val="24"/>
         </w:rPr>
         <w:t xml:space="preserve">σθ,покр ≈ Eпокр · εобода</w:t>
+      </w:r>
+    </w:p>
+    <w:p>
+      <w:pPr>
+        <w:spacing w:after="120"/>
+      </w:pPr>
+      <w:r>
+        <w:rPr>
+          <w:i/>
+          <w:iCs/>
+        </w:rPr>
+        <w:t xml:space="preserve">Уточнение: плёнка зажата и по окружности, и вдоль оси, поэтому строго σθ,покр = Eпокр·εобода·(1 − νпокр·νдиска)/(1 − νпокр²). При νпокр = 0,25 и νдиска = 0,3…0,33 множитель ≈ 0,98, то есть поправка около 2 %.</w:t>
       </w:r>
     </w:p>
     <w:p>
@@ -1777,7 +1801,7 @@
         <w:t xml:space="preserve">Напряжение в покрытии.</w:t>
       </w:r>
       <w:r>
-        <w:t xml:space="preserve"> Модуль упругости напылённого WC‑Co из-за пористости ниже, чем у литого твёрдого сплава: примерно 300–600 ГПа.</w:t>
+        <w:t xml:space="preserve"> Модуль упругости напылённого WC‑Co из-за пористости ниже, чем у литого твёрдого сплава: примерно 300–600 ГПа (нижняя граница — пористое напылённое покрытие, верхняя — плотное, близкое к спечённому твёрдому сплаву; для HVOF‑покрытий в литературе часто приводят 250–450 ГПа).</w:t>
       </w:r>
     </w:p>
     <w:tbl>
@@ -2111,7 +2135,7 @@
         <w:t xml:space="preserve">Температура.</w:t>
       </w:r>
       <w:r>
-        <w:t xml:space="preserve"> Если диск нагревается и его коэффициент теплового расширения больше, чем у покрытия (сталь ~12·10⁻⁶ 1/К, титан ~9·10⁻⁶ 1/К, WC‑Co ~5–6·10⁻⁶ 1/К), покрытие дополнительно растягивается: Δσ ≈ Eпокр·Δα·ΔT. Например, 400 ГПа · 6·10⁻⁶ · 200 К ≈ +480 МПа. Это может оказаться главной нагрузкой.</w:t>
+        <w:t xml:space="preserve"> Если диск нагревается и его коэффициент теплового расширения больше, чем у покрытия (сталь ~12·10⁻⁶ 1/К, титан ~9·10⁻⁶ 1/К, WC‑Co ~5–6·10⁻⁶ 1/К), покрытие дополнительно растягивается: Δσ ≈ Eпокр·Δα·ΔT / (1 − νпокр) — делитель (1 − ν) учитывает, что тонкая плёнка зажата сразу в двух направлениях. Например, 400 ГПа · 6·10⁻⁶ · 200 К / 0,75 ≈ +640 МПа. Это может оказаться главной нагрузкой.</w:t>
       </w:r>
     </w:p>
     <w:p>
@@ -2551,7 +2575,444 @@
         <w:pStyle w:val="Heading1"/>
       </w:pPr>
       <w:r>
-        <w:t xml:space="preserve">8. Что нужно для уточнения</w:t>
+        <w:t xml:space="preserve">8. Источники формул</w:t>
+      </w:r>
+    </w:p>
+    <w:tbl>
+      <w:tblPr>
+        <w:tblW w:type="dxa" w:w="9638"/>
+        <w:tblBorders>
+          <w:top w:val="single" w:color="auto" w:sz="4"/>
+          <w:left w:val="single" w:color="auto" w:sz="4"/>
+          <w:bottom w:val="single" w:color="auto" w:sz="4"/>
+          <w:right w:val="single" w:color="auto" w:sz="4"/>
+          <w:insideH w:val="single" w:color="auto" w:sz="4"/>
+          <w:insideV w:val="single" w:color="auto" w:sz="4"/>
+        </w:tblBorders>
+      </w:tblPr>
+      <w:tblGrid>
+        <w:gridCol w:w="3600"/>
+        <w:gridCol w:w="6038"/>
+      </w:tblGrid>
+      <w:tr>
+        <w:trPr>
+          <w:tblHeader/>
+        </w:trPr>
+        <w:tc>
+          <w:tcPr>
+            <w:tcW w:type="dxa" w:w="3600"/>
+            <w:shd w:fill="DCE6F1" w:val="clear"/>
+            <w:tcMar>
+              <w:top w:type="dxa" w:w="60"/>
+              <w:left w:type="dxa" w:w="100"/>
+              <w:bottom w:type="dxa" w:w="60"/>
+              <w:right w:type="dxa" w:w="100"/>
+            </w:tcMar>
+          </w:tcPr>
+          <w:p>
+            <w:r>
+              <w:rPr>
+                <w:b/>
+                <w:bCs/>
+              </w:rPr>
+              <w:t xml:space="preserve">Формула</w:t>
+            </w:r>
+          </w:p>
+        </w:tc>
+        <w:tc>
+          <w:tcPr>
+            <w:tcW w:type="dxa" w:w="6038"/>
+            <w:shd w:fill="DCE6F1" w:val="clear"/>
+            <w:tcMar>
+              <w:top w:type="dxa" w:w="60"/>
+              <w:left w:type="dxa" w:w="100"/>
+              <w:bottom w:type="dxa" w:w="60"/>
+              <w:right w:type="dxa" w:w="100"/>
+            </w:tcMar>
+          </w:tcPr>
+          <w:p>
+            <w:r>
+              <w:rPr>
+                <w:b/>
+                <w:bCs/>
+              </w:rPr>
+              <w:t xml:space="preserve">Где проверить</w:t>
+            </w:r>
+          </w:p>
+        </w:tc>
+      </w:tr>
+      <w:tr>
+        <w:trPr>
+          <w:tblHeader w:val="false"/>
+        </w:trPr>
+        <w:tc>
+          <w:tcPr>
+            <w:tcW w:type="dxa" w:w="3600"/>
+            <w:tcMar>
+              <w:top w:type="dxa" w:w="60"/>
+              <w:left w:type="dxa" w:w="100"/>
+              <w:bottom w:type="dxa" w:w="60"/>
+              <w:right w:type="dxa" w:w="100"/>
+            </w:tcMar>
+          </w:tcPr>
+          <w:p>
+            <w:r>
+              <w:rPr>
+                <w:b w:val="false"/>
+                <w:bCs w:val="false"/>
+              </w:rPr>
+              <w:t xml:space="preserve">ω = 2πn/60;  v = ωR;  a = ω²R</w:t>
+            </w:r>
+          </w:p>
+        </w:tc>
+        <w:tc>
+          <w:tcPr>
+            <w:tcW w:type="dxa" w:w="6038"/>
+            <w:tcMar>
+              <w:top w:type="dxa" w:w="60"/>
+              <w:left w:type="dxa" w:w="100"/>
+              <w:bottom w:type="dxa" w:w="60"/>
+              <w:right w:type="dxa" w:w="100"/>
+            </w:tcMar>
+          </w:tcPr>
+          <w:p>
+            <w:r>
+              <w:rPr>
+                <w:b w:val="false"/>
+                <w:bCs w:val="false"/>
+              </w:rPr>
+              <w:t xml:space="preserve">Любой курс теоретической механики (кинематика вращательного движения), напр. Тарг С.М. «Краткий курс теоретической механики»</w:t>
+            </w:r>
+          </w:p>
+        </w:tc>
+      </w:tr>
+      <w:tr>
+        <w:trPr>
+          <w:tblHeader w:val="false"/>
+        </w:trPr>
+        <w:tc>
+          <w:tcPr>
+            <w:tcW w:type="dxa" w:w="3600"/>
+            <w:tcMar>
+              <w:top w:type="dxa" w:w="60"/>
+              <w:left w:type="dxa" w:w="100"/>
+              <w:bottom w:type="dxa" w:w="60"/>
+              <w:right w:type="dxa" w:w="100"/>
+            </w:tcMar>
+          </w:tcPr>
+          <w:p>
+            <w:r>
+              <w:rPr>
+                <w:b w:val="false"/>
+                <w:bCs w:val="false"/>
+              </w:rPr>
+              <w:t xml:space="preserve">σθ = ρv² — тонкое вращающееся кольцо</w:t>
+            </w:r>
+          </w:p>
+        </w:tc>
+        <w:tc>
+          <w:tcPr>
+            <w:tcW w:type="dxa" w:w="6038"/>
+            <w:tcMar>
+              <w:top w:type="dxa" w:w="60"/>
+              <w:left w:type="dxa" w:w="100"/>
+              <w:bottom w:type="dxa" w:w="60"/>
+              <w:right w:type="dxa" w:w="100"/>
+            </w:tcMar>
+          </w:tcPr>
+          <w:p>
+            <w:r>
+              <w:rPr>
+                <w:b w:val="false"/>
+                <w:bCs w:val="false"/>
+              </w:rPr>
+              <w:t xml:space="preserve">Феодосьев В.И. «Сопротивление материалов» (расчёт тонкого вращающегося кольца); Беляев Н.М. «Сопротивление материалов»; Timoshenko S. «Strength of Materials», Part II</w:t>
+            </w:r>
+          </w:p>
+        </w:tc>
+      </w:tr>
+      <w:tr>
+        <w:trPr>
+          <w:tblHeader w:val="false"/>
+        </w:trPr>
+        <w:tc>
+          <w:tcPr>
+            <w:tcW w:type="dxa" w:w="3600"/>
+            <w:tcMar>
+              <w:top w:type="dxa" w:w="60"/>
+              <w:left w:type="dxa" w:w="100"/>
+              <w:bottom w:type="dxa" w:w="60"/>
+              <w:right w:type="dxa" w:w="100"/>
+            </w:tcMar>
+          </w:tcPr>
+          <w:p>
+            <w:r>
+              <w:rPr>
+                <w:b w:val="false"/>
+                <w:bCs w:val="false"/>
+              </w:rPr>
+              <w:t xml:space="preserve">Сплошной диск: σθ(r) = (3+ν)/8·ρω²R² − (1+3ν)/8·ρω²r²;  σr(R) = 0;  σθ(R) = (1−ν)/4·ρv²</w:t>
+            </w:r>
+          </w:p>
+        </w:tc>
+        <w:tc>
+          <w:tcPr>
+            <w:tcW w:type="dxa" w:w="6038"/>
+            <w:tcMar>
+              <w:top w:type="dxa" w:w="60"/>
+              <w:left w:type="dxa" w:w="100"/>
+              <w:bottom w:type="dxa" w:w="60"/>
+              <w:right w:type="dxa" w:w="100"/>
+            </w:tcMar>
+          </w:tcPr>
+          <w:p>
+            <w:r>
+              <w:rPr>
+                <w:b w:val="false"/>
+                <w:bCs w:val="false"/>
+              </w:rPr>
+              <w:t xml:space="preserve">Тимошенко С.П., Гудьер Дж. «Теория упругости» (вращающиеся диски постоянной толщины); Биргер И.А., Шорр Б.Ф., Иосилевич Г.Б. «Расчёт на прочность деталей машин» (глава о дисках); Демьянушко И.В., Биргер И.А. «Расчёт на прочность вращающихся дисков»</w:t>
+            </w:r>
+          </w:p>
+        </w:tc>
+      </w:tr>
+      <w:tr>
+        <w:trPr>
+          <w:tblHeader w:val="false"/>
+        </w:trPr>
+        <w:tc>
+          <w:tcPr>
+            <w:tcW w:type="dxa" w:w="3600"/>
+            <w:tcMar>
+              <w:top w:type="dxa" w:w="60"/>
+              <w:left w:type="dxa" w:w="100"/>
+              <w:bottom w:type="dxa" w:w="60"/>
+              <w:right w:type="dxa" w:w="100"/>
+            </w:tcMar>
+          </w:tcPr>
+          <w:p>
+            <w:r>
+              <w:rPr>
+                <w:b w:val="false"/>
+                <w:bCs w:val="false"/>
+              </w:rPr>
+              <w:t xml:space="preserve">εθ = (σθ − νσr)/E — закон Гука</w:t>
+            </w:r>
+          </w:p>
+        </w:tc>
+        <w:tc>
+          <w:tcPr>
+            <w:tcW w:type="dxa" w:w="6038"/>
+            <w:tcMar>
+              <w:top w:type="dxa" w:w="60"/>
+              <w:left w:type="dxa" w:w="100"/>
+              <w:bottom w:type="dxa" w:w="60"/>
+              <w:right w:type="dxa" w:w="100"/>
+            </w:tcMar>
+          </w:tcPr>
+          <w:p>
+            <w:r>
+              <w:rPr>
+                <w:b w:val="false"/>
+                <w:bCs w:val="false"/>
+              </w:rPr>
+              <w:t xml:space="preserve">Любой курс сопротивления материалов (обобщённый закон Гука)</w:t>
+            </w:r>
+          </w:p>
+        </w:tc>
+      </w:tr>
+      <w:tr>
+        <w:trPr>
+          <w:tblHeader w:val="false"/>
+        </w:trPr>
+        <w:tc>
+          <w:tcPr>
+            <w:tcW w:type="dxa" w:w="3600"/>
+            <w:tcMar>
+              <w:top w:type="dxa" w:w="60"/>
+              <w:left w:type="dxa" w:w="100"/>
+              <w:bottom w:type="dxa" w:w="60"/>
+              <w:right w:type="dxa" w:w="100"/>
+            </w:tcMar>
+          </w:tcPr>
+          <w:p>
+            <w:r>
+              <w:rPr>
+                <w:b w:val="false"/>
+                <w:bCs w:val="false"/>
+              </w:rPr>
+              <w:t xml:space="preserve">p = ρ·h·ω²·R — давление от слоя массы</w:t>
+            </w:r>
+          </w:p>
+        </w:tc>
+        <w:tc>
+          <w:tcPr>
+            <w:tcW w:type="dxa" w:w="6038"/>
+            <w:tcMar>
+              <w:top w:type="dxa" w:w="60"/>
+              <w:left w:type="dxa" w:w="100"/>
+              <w:bottom w:type="dxa" w:w="60"/>
+              <w:right w:type="dxa" w:w="100"/>
+            </w:tcMar>
+          </w:tcPr>
+          <w:p>
+            <w:r>
+              <w:rPr>
+                <w:b w:val="false"/>
+                <w:bCs w:val="false"/>
+              </w:rPr>
+              <w:t xml:space="preserve">Интегрирование центробежной нагрузки по толщине; та же схема, что для лопаточной (контурной) нагрузки на обод в Биргер, Шорр, Иосилевич</w:t>
+            </w:r>
+          </w:p>
+        </w:tc>
+      </w:tr>
+      <w:tr>
+        <w:trPr>
+          <w:tblHeader w:val="false"/>
+        </w:trPr>
+        <w:tc>
+          <w:tcPr>
+            <w:tcW w:type="dxa" w:w="3600"/>
+            <w:tcMar>
+              <w:top w:type="dxa" w:w="60"/>
+              <w:left w:type="dxa" w:w="100"/>
+              <w:bottom w:type="dxa" w:w="60"/>
+              <w:right w:type="dxa" w:w="100"/>
+            </w:tcMar>
+          </w:tcPr>
+          <w:p>
+            <w:r>
+              <w:rPr>
+                <w:b w:val="false"/>
+                <w:bCs w:val="false"/>
+              </w:rPr>
+              <w:t xml:space="preserve">σθ·h/R = ρhω²R − p — равновесие кольца</w:t>
+            </w:r>
+          </w:p>
+        </w:tc>
+        <w:tc>
+          <w:tcPr>
+            <w:tcW w:type="dxa" w:w="6038"/>
+            <w:tcMar>
+              <w:top w:type="dxa" w:w="60"/>
+              <w:left w:type="dxa" w:w="100"/>
+              <w:bottom w:type="dxa" w:w="60"/>
+              <w:right w:type="dxa" w:w="100"/>
+            </w:tcMar>
+          </w:tcPr>
+          <w:p>
+            <w:r>
+              <w:rPr>
+                <w:b w:val="false"/>
+                <w:bCs w:val="false"/>
+              </w:rPr>
+              <w:t xml:space="preserve">Формула тонкостенного кольца/сосуда σ = pR/h (Феодосьев, Беляев — тонкостенные оболочки)</w:t>
+            </w:r>
+          </w:p>
+        </w:tc>
+      </w:tr>
+      <w:tr>
+        <w:trPr>
+          <w:tblHeader w:val="false"/>
+        </w:trPr>
+        <w:tc>
+          <w:tcPr>
+            <w:tcW w:type="dxa" w:w="3600"/>
+            <w:tcMar>
+              <w:top w:type="dxa" w:w="60"/>
+              <w:left w:type="dxa" w:w="100"/>
+              <w:bottom w:type="dxa" w:w="60"/>
+              <w:right w:type="dxa" w:w="100"/>
+            </w:tcMar>
+          </w:tcPr>
+          <w:p>
+            <w:r>
+              <w:rPr>
+                <w:b w:val="false"/>
+                <w:bCs w:val="false"/>
+              </w:rPr>
+              <w:t xml:space="preserve">Δσ = E·Δα·ΔT/(1−ν) — термонапряжения в плёнке</w:t>
+            </w:r>
+          </w:p>
+        </w:tc>
+        <w:tc>
+          <w:tcPr>
+            <w:tcW w:type="dxa" w:w="6038"/>
+            <w:tcMar>
+              <w:top w:type="dxa" w:w="60"/>
+              <w:left w:type="dxa" w:w="100"/>
+              <w:bottom w:type="dxa" w:w="60"/>
+              <w:right w:type="dxa" w:w="100"/>
+            </w:tcMar>
+          </w:tcPr>
+          <w:p>
+            <w:r>
+              <w:rPr>
+                <w:b w:val="false"/>
+                <w:bCs w:val="false"/>
+              </w:rPr>
+              <w:t xml:space="preserve">Freund L.B., Suresh S. «Thin Film Materials» (двухосный модуль E/(1−ν))</w:t>
+            </w:r>
+          </w:p>
+        </w:tc>
+      </w:tr>
+      <w:tr>
+        <w:trPr>
+          <w:tblHeader w:val="false"/>
+        </w:trPr>
+        <w:tc>
+          <w:tcPr>
+            <w:tcW w:type="dxa" w:w="3600"/>
+            <w:tcMar>
+              <w:top w:type="dxa" w:w="60"/>
+              <w:left w:type="dxa" w:w="100"/>
+              <w:bottom w:type="dxa" w:w="60"/>
+              <w:right w:type="dxa" w:w="100"/>
+            </w:tcMar>
+          </w:tcPr>
+          <w:p>
+            <w:r>
+              <w:rPr>
+                <w:b w:val="false"/>
+                <w:bCs w:val="false"/>
+              </w:rPr>
+              <w:t xml:space="preserve">Адгезия покрытия на отрыв</w:t>
+            </w:r>
+          </w:p>
+        </w:tc>
+        <w:tc>
+          <w:tcPr>
+            <w:tcW w:type="dxa" w:w="6038"/>
+            <w:tcMar>
+              <w:top w:type="dxa" w:w="60"/>
+              <w:left w:type="dxa" w:w="100"/>
+              <w:bottom w:type="dxa" w:w="60"/>
+              <w:right w:type="dxa" w:w="100"/>
+            </w:tcMar>
+          </w:tcPr>
+          <w:p>
+            <w:r>
+              <w:rPr>
+                <w:b w:val="false"/>
+                <w:bCs w:val="false"/>
+              </w:rPr>
+              <w:t xml:space="preserve">Метод испытаний ASTM C633 (Standard Test Method for Adhesion or Cohesion Strength of Thermal Spray Coatings)</w:t>
+            </w:r>
+          </w:p>
+        </w:tc>
+      </w:tr>
+    </w:tbl>
+    <w:p>
+      <w:pPr>
+        <w:spacing w:after="60"/>
+      </w:pPr>
+    </w:p>
+    <w:p>
+      <w:pPr>
+        <w:pStyle w:val="Heading1"/>
+      </w:pPr>
+      <w:r>
+        <w:t xml:space="preserve">9. Что нужно для уточнения</w:t>
       </w:r>
     </w:p>
     <w:p>

</xml_diff>